<commit_message>
AI quick start: rewrite for the GitHub Copilot desktop app, with screenshots
Covers the app's real flow: + next to Projects > Open folder, a session
in Current checkout, the model and mode chips under the prompt box,
attaching the excise .md with @, /context to watch credits, and commit
and push. Screenshots from GitHub's MIT-licensed 'GitHub Copilot app
for Beginners' course, credited in the deck and doc.

Co-Authored-By: Claude Opus 5.5 <noreply@anthropic.com>
Claude-Session: https://claude.ai/code/session_01RpqXLYeMJosQsdhqgJkes9
</commit_message>
<xml_diff>
--- a/user_guide/AI_Tools_Quick_Start.docx
+++ b/user_guide/AI_Tools_Quick_Start.docx
@@ -8,9 +8,26 @@
       </w:pPr>
       <w:r>
         <w:rPr>
-          <w:sz w:val="48"/>
+          <w:sz w:val="52"/>
         </w:rPr>
-        <w:t>AI Tools Quick Start (GitHub Copilot)</w:t>
+        <w:t>AI Tools Quick Start</w:t>
+      </w:r>
+    </w:p>
+    <w:p>
+      <w:r>
+        <w:rPr>
+          <w:i/>
+          <w:color w:val="404040"/>
+        </w:rPr>
+        <w:t>Two examples with the GitHub Copilot app. October 2026.</w:t>
+      </w:r>
+    </w:p>
+    <w:p>
+      <w:pPr>
+        <w:pStyle w:val="Heading1"/>
+      </w:pPr>
+      <w:r>
+        <w:t>We assume you already have</w:t>
       </w:r>
     </w:p>
     <w:p>
@@ -18,10 +35,10 @@
         <w:rPr>
           <w:b/>
         </w:rPr>
-        <w:t xml:space="preserve">You need: </w:t>
+        <w:t xml:space="preserve">✓  </w:t>
       </w:r>
       <w:r>
-        <w:t>The new-ai-tools repo on your laptop, and GitHub Copilot in VS Code.</w:t>
+        <w:t>The new-ai-tools repo downloaded on your laptop (C:\Users\&lt;you&gt;\Repos\new-ai-tools) and up to date.</w:t>
       </w:r>
     </w:p>
     <w:p>
@@ -29,10 +46,23 @@
         <w:rPr>
           <w:b/>
         </w:rPr>
-        <w:t xml:space="preserve">To start: </w:t>
+        <w:t xml:space="preserve">✓  </w:t>
       </w:r>
       <w:r>
-        <w:t>Open the repo in VS Code, click Sync, open Copilot Chat in Agent mode. Paste one prompt. Read the answer. Then paste the next.</w:t>
+        <w:t>The GitHub Copilot app installed (Microsoft Store) and signed in with your GitHub account.</w:t>
+      </w:r>
+    </w:p>
+    <w:p>
+      <w:r>
+        <w:rPr>
+          <w:i/>
+        </w:rPr>
+        <w:t>Not there yet? See Presentations/GitHub_Copilot_AI_User_Guide.pptx.</w:t>
+      </w:r>
+    </w:p>
+    <w:p>
+      <w:r>
+        <w:t>Steps 1-2 set up a session. Then do Example 1 or Example 2. Step 3 saves your work.</w:t>
       </w:r>
     </w:p>
     <w:p>
@@ -40,18 +70,308 @@
         <w:pStyle w:val="Heading1"/>
       </w:pPr>
       <w:r>
-        <w:t>1. Excise diagnostic for Indonesia</w:t>
+        <w:t>Step 1. Open the repo and start a session (once per task)</w:t>
+      </w:r>
+    </w:p>
+    <w:p>
+      <w:pPr>
+        <w:ind w:left="397" w:hanging="397"/>
+      </w:pPr>
+      <w:r>
+        <w:rPr>
+          <w:b/>
+        </w:rPr>
+        <w:t>1.</w:t>
+        <w:tab/>
+        <w:t xml:space="preserve">Add the repo (first time only). </w:t>
+      </w:r>
+      <w:r>
+        <w:t>In the sidebar, click + next to Projects, then Open folder. Pick Repos\new-ai-tools. It stays in the sidebar.</w:t>
+      </w:r>
+    </w:p>
+    <w:p>
+      <w:pPr>
+        <w:ind w:left="397" w:hanging="397"/>
+      </w:pPr>
+      <w:r>
+        <w:rPr>
+          <w:b/>
+        </w:rPr>
+        <w:t>2.</w:t>
+        <w:tab/>
+        <w:t xml:space="preserve">Start a session. </w:t>
+      </w:r>
+      <w:r>
+        <w:t>Point at new-ai-tools in the sidebar and click the + next to it.</w:t>
+      </w:r>
+    </w:p>
+    <w:p>
+      <w:pPr>
+        <w:ind w:left="397" w:hanging="397"/>
+      </w:pPr>
+      <w:r>
+        <w:rPr>
+          <w:b/>
+        </w:rPr>
+        <w:t>3.</w:t>
+        <w:tab/>
+        <w:t xml:space="preserve">Work in your folder. </w:t>
+      </w:r>
+      <w:r>
+        <w:t>Under the prompt box, open the workspace selector and choose Current checkout. Copilot then edits the repo folder on your laptop.</w:t>
+      </w:r>
+    </w:p>
+    <w:p>
+      <w:r>
+        <w:drawing>
+          <wp:inline xmlns:a="http://schemas.openxmlformats.org/drawingml/2006/main" xmlns:pic="http://schemas.openxmlformats.org/drawingml/2006/picture">
+            <wp:extent cx="3960000" cy="1218462"/>
+            <wp:docPr id="1" name="Picture 1"/>
+            <wp:cNvGraphicFramePr>
+              <a:graphicFrameLocks noChangeAspect="1"/>
+            </wp:cNvGraphicFramePr>
+            <a:graphic>
+              <a:graphicData uri="http://schemas.openxmlformats.org/drawingml/2006/picture">
+                <pic:pic>
+                  <pic:nvPicPr>
+                    <pic:cNvPr id="0" name="s_addproj.png"/>
+                    <pic:cNvPicPr/>
+                  </pic:nvPicPr>
+                  <pic:blipFill>
+                    <a:blip r:embed="rId9"/>
+                    <a:stretch>
+                      <a:fillRect/>
+                    </a:stretch>
+                  </pic:blipFill>
+                  <pic:spPr>
+                    <a:xfrm>
+                      <a:off x="0" y="0"/>
+                      <a:ext cx="3960000" cy="1218462"/>
+                    </a:xfrm>
+                    <a:prstGeom prst="rect"/>
+                  </pic:spPr>
+                </pic:pic>
+              </a:graphicData>
+            </a:graphic>
+          </wp:inline>
+        </w:drawing>
       </w:r>
     </w:p>
     <w:p>
       <w:r>
         <w:rPr>
+          <w:i/>
+          <w:color w:val="404040"/>
+          <w:sz w:val="18"/>
+        </w:rPr>
+        <w:t>+ next to Projects, then Open folder</w:t>
+      </w:r>
+    </w:p>
+    <w:p>
+      <w:r>
+        <w:drawing>
+          <wp:inline xmlns:a="http://schemas.openxmlformats.org/drawingml/2006/main" xmlns:pic="http://schemas.openxmlformats.org/drawingml/2006/picture">
+            <wp:extent cx="3960000" cy="1900800"/>
+            <wp:docPr id="2" name="Picture 2"/>
+            <wp:cNvGraphicFramePr>
+              <a:graphicFrameLocks noChangeAspect="1"/>
+            </wp:cNvGraphicFramePr>
+            <a:graphic>
+              <a:graphicData uri="http://schemas.openxmlformats.org/drawingml/2006/picture">
+                <pic:pic>
+                  <pic:nvPicPr>
+                    <pic:cNvPr id="0" name="s_checkout.png"/>
+                    <pic:cNvPicPr/>
+                  </pic:nvPicPr>
+                  <pic:blipFill>
+                    <a:blip r:embed="rId10"/>
+                    <a:stretch>
+                      <a:fillRect/>
+                    </a:stretch>
+                  </pic:blipFill>
+                  <pic:spPr>
+                    <a:xfrm>
+                      <a:off x="0" y="0"/>
+                      <a:ext cx="3960000" cy="1900800"/>
+                    </a:xfrm>
+                    <a:prstGeom prst="rect"/>
+                  </pic:spPr>
+                </pic:pic>
+              </a:graphicData>
+            </a:graphic>
+          </wp:inline>
+        </w:drawing>
+      </w:r>
+    </w:p>
+    <w:p>
+      <w:r>
+        <w:rPr>
+          <w:i/>
+          <w:color w:val="404040"/>
+          <w:sz w:val="18"/>
+        </w:rPr>
+        <w:t>Workspace selector, then Current checkout</w:t>
+      </w:r>
+    </w:p>
+    <w:p>
+      <w:pPr>
+        <w:pStyle w:val="Heading1"/>
+      </w:pPr>
+      <w:r>
+        <w:t>Step 2. Pick the model and the mode (every session)</w:t>
+      </w:r>
+    </w:p>
+    <w:p>
+      <w:pPr>
+        <w:ind w:left="397" w:hanging="397"/>
+      </w:pPr>
+      <w:r>
+        <w:rPr>
           <w:b/>
         </w:rPr>
-        <w:t xml:space="preserve">Model: </w:t>
+        <w:t>1.</w:t>
+        <w:tab/>
+        <w:t xml:space="preserve">Model. </w:t>
       </w:r>
       <w:r>
-        <w:t>Claude Opus</w:t>
+        <w:t>Click the model chip under the prompt box. Switch Auto off, then pick Model: Claude Sonnet for everyday work, Claude Opus for the excise research.</w:t>
+      </w:r>
+    </w:p>
+    <w:p>
+      <w:pPr>
+        <w:ind w:left="397" w:hanging="397"/>
+      </w:pPr>
+      <w:r>
+        <w:rPr>
+          <w:b/>
+        </w:rPr>
+        <w:t>2.</w:t>
+        <w:tab/>
+        <w:t xml:space="preserve">Mode. </w:t>
+      </w:r>
+      <w:r>
+        <w:t>Click the mode chip and pick Interactive: Copilot asks before it acts.</w:t>
+      </w:r>
+    </w:p>
+    <w:p>
+      <w:pPr>
+        <w:ind w:left="397" w:hanging="397"/>
+      </w:pPr>
+      <w:r>
+        <w:rPr>
+          <w:b/>
+        </w:rPr>
+        <w:t>3.</w:t>
+        <w:tab/>
+        <w:t xml:space="preserve">Credits. </w:t>
+      </w:r>
+      <w:r>
+        <w:t>Type /context at any time to see the AI credits the session has used.</w:t>
+      </w:r>
+    </w:p>
+    <w:p>
+      <w:r>
+        <w:drawing>
+          <wp:inline xmlns:a="http://schemas.openxmlformats.org/drawingml/2006/main" xmlns:pic="http://schemas.openxmlformats.org/drawingml/2006/picture">
+            <wp:extent cx="3960000" cy="1166785"/>
+            <wp:docPr id="3" name="Picture 3"/>
+            <wp:cNvGraphicFramePr>
+              <a:graphicFrameLocks noChangeAspect="1"/>
+            </wp:cNvGraphicFramePr>
+            <a:graphic>
+              <a:graphicData uri="http://schemas.openxmlformats.org/drawingml/2006/picture">
+                <pic:pic>
+                  <pic:nvPicPr>
+                    <pic:cNvPr id="0" name="s_model.png"/>
+                    <pic:cNvPicPr/>
+                  </pic:nvPicPr>
+                  <pic:blipFill>
+                    <a:blip r:embed="rId11"/>
+                    <a:stretch>
+                      <a:fillRect/>
+                    </a:stretch>
+                  </pic:blipFill>
+                  <pic:spPr>
+                    <a:xfrm>
+                      <a:off x="0" y="0"/>
+                      <a:ext cx="3960000" cy="1166785"/>
+                    </a:xfrm>
+                    <a:prstGeom prst="rect"/>
+                  </pic:spPr>
+                </pic:pic>
+              </a:graphicData>
+            </a:graphic>
+          </wp:inline>
+        </w:drawing>
+      </w:r>
+    </w:p>
+    <w:p>
+      <w:r>
+        <w:rPr>
+          <w:i/>
+          <w:color w:val="404040"/>
+          <w:sz w:val="18"/>
+        </w:rPr>
+        <w:t>Model chip: Auto off, then Model</w:t>
+      </w:r>
+    </w:p>
+    <w:p>
+      <w:r>
+        <w:drawing>
+          <wp:inline xmlns:a="http://schemas.openxmlformats.org/drawingml/2006/main" xmlns:pic="http://schemas.openxmlformats.org/drawingml/2006/picture">
+            <wp:extent cx="3960000" cy="1909286"/>
+            <wp:docPr id="4" name="Picture 4"/>
+            <wp:cNvGraphicFramePr>
+              <a:graphicFrameLocks noChangeAspect="1"/>
+            </wp:cNvGraphicFramePr>
+            <a:graphic>
+              <a:graphicData uri="http://schemas.openxmlformats.org/drawingml/2006/picture">
+                <pic:pic>
+                  <pic:nvPicPr>
+                    <pic:cNvPr id="0" name="s_modes.png"/>
+                    <pic:cNvPicPr/>
+                  </pic:nvPicPr>
+                  <pic:blipFill>
+                    <a:blip r:embed="rId12"/>
+                    <a:stretch>
+                      <a:fillRect/>
+                    </a:stretch>
+                  </pic:blipFill>
+                  <pic:spPr>
+                    <a:xfrm>
+                      <a:off x="0" y="0"/>
+                      <a:ext cx="3960000" cy="1909286"/>
+                    </a:xfrm>
+                    <a:prstGeom prst="rect"/>
+                  </pic:spPr>
+                </pic:pic>
+              </a:graphicData>
+            </a:graphic>
+          </wp:inline>
+        </w:drawing>
+      </w:r>
+    </w:p>
+    <w:p>
+      <w:r>
+        <w:rPr>
+          <w:i/>
+          <w:color w:val="404040"/>
+          <w:sz w:val="18"/>
+        </w:rPr>
+        <w:t>Mode chip: pick Interactive</w:t>
+      </w:r>
+    </w:p>
+    <w:p>
+      <w:r>
+        <w:br w:type="page"/>
+      </w:r>
+    </w:p>
+    <w:p>
+      <w:pPr>
+        <w:pStyle w:val="Heading1"/>
+      </w:pPr>
+      <w:r>
+        <w:t>Excise diagnostic for Indonesia  (Claude Opus · Interactive)</w:t>
       </w:r>
     </w:p>
     <w:p>
@@ -63,12 +383,20 @@
           <w:b/>
           <w:color w:val="C0392B"/>
         </w:rPr>
-        <w:t>⚠  Uses a lot of credits: one prompt at a time.</w:t>
+        <w:t>⚠  Deep research uses a lot of credits. Send one prompt, read the answer, then send the next. Check /context as you go. Stop and fix anything wrong before going on.</w:t>
       </w:r>
     </w:p>
     <w:p>
       <w:r>
-        <w:t>First, attach excise_diagnostic_process.md to the chat (drag it in, or click Add Context). It is the instruction file Copilot follows.</w:t>
+        <w:t>Attach the instructions: type @ and pick user_guide/excise_diagnostic_process.md (or drag the file onto the prompt box).</w:t>
+      </w:r>
+    </w:p>
+    <w:p>
+      <w:r>
+        <w:rPr>
+          <w:b/>
+        </w:rPr>
+        <w:t>Paste:</w:t>
       </w:r>
     </w:p>
     <w:p>
@@ -78,13 +406,16 @@
       <w:r>
         <w:rPr>
           <w:rFonts w:ascii="Consolas" w:hAnsi="Consolas"/>
-          <w:sz w:val="20"/>
+          <w:sz w:val="19"/>
         </w:rPr>
-        <w:t>Using the attached file, run stage A1 for Indonesia, 2020 to 2026-09-30. Stop after A1.</w:t>
+        <w:t>@user_guide/excise_diagnostic_process.md Follow this file. Run stage A1 for Indonesia, 2020 to 2026-09-30. Search the web for the laws. Stop after A1.</w:t>
       </w:r>
     </w:p>
     <w:p>
       <w:r>
+        <w:rPr>
+          <w:b/>
+        </w:rPr>
         <w:t>Then, one at a time:</w:t>
       </w:r>
     </w:p>
@@ -95,7 +426,7 @@
       <w:r>
         <w:rPr>
           <w:rFonts w:ascii="Consolas" w:hAnsi="Consolas"/>
-          <w:sz w:val="20"/>
+          <w:sz w:val="19"/>
         </w:rPr>
         <w:t>Run stage A2.</w:t>
       </w:r>
@@ -107,7 +438,7 @@
       <w:r>
         <w:rPr>
           <w:rFonts w:ascii="Consolas" w:hAnsi="Consolas"/>
-          <w:sz w:val="20"/>
+          <w:sz w:val="19"/>
         </w:rPr>
         <w:t>Run stage A3.</w:t>
       </w:r>
@@ -119,7 +450,7 @@
       <w:r>
         <w:rPr>
           <w:rFonts w:ascii="Consolas" w:hAnsi="Consolas"/>
-          <w:sz w:val="20"/>
+          <w:sz w:val="19"/>
         </w:rPr>
         <w:t>Run stage A4.</w:t>
       </w:r>
@@ -131,7 +462,7 @@
       <w:r>
         <w:rPr>
           <w:rFonts w:ascii="Consolas" w:hAnsi="Consolas"/>
-          <w:sz w:val="20"/>
+          <w:sz w:val="19"/>
         </w:rPr>
         <w:t>Run stage A5.</w:t>
       </w:r>
@@ -143,9 +474,9 @@
       <w:r>
         <w:rPr>
           <w:rFonts w:ascii="Consolas" w:hAnsi="Consolas"/>
-          <w:sz w:val="20"/>
+          <w:sz w:val="19"/>
         </w:rPr>
-        <w:t>Run stage A6 and save the Word report and Excel workbook in ExciseDiagnostic/country_results/Indonesia/.</w:t>
+        <w:t>Run stage A6. Save the Word report and Excel workbook in ExciseDiagnostic/country_results/Indonesia/.</w:t>
       </w:r>
     </w:p>
     <w:p>
@@ -156,7 +487,58 @@
         <w:t xml:space="preserve">Check: </w:t>
       </w:r>
       <w:r>
-        <w:t>Every rate has a date and a source link.</w:t>
+        <w:t>Every rate quoted with its date and a source link; missing data says data_gap.</w:t>
+      </w:r>
+    </w:p>
+    <w:p>
+      <w:r>
+        <w:drawing>
+          <wp:inline xmlns:a="http://schemas.openxmlformats.org/drawingml/2006/main" xmlns:pic="http://schemas.openxmlformats.org/drawingml/2006/picture">
+            <wp:extent cx="4680000" cy="2632500"/>
+            <wp:docPr id="5" name="Picture 5"/>
+            <wp:cNvGraphicFramePr>
+              <a:graphicFrameLocks noChangeAspect="1"/>
+            </wp:cNvGraphicFramePr>
+            <a:graphic>
+              <a:graphicData uri="http://schemas.openxmlformats.org/drawingml/2006/picture">
+                <pic:pic>
+                  <pic:nvPicPr>
+                    <pic:cNvPr id="0" name="s_working.png"/>
+                    <pic:cNvPicPr/>
+                  </pic:nvPicPr>
+                  <pic:blipFill>
+                    <a:blip r:embed="rId13"/>
+                    <a:stretch>
+                      <a:fillRect/>
+                    </a:stretch>
+                  </pic:blipFill>
+                  <pic:spPr>
+                    <a:xfrm>
+                      <a:off x="0" y="0"/>
+                      <a:ext cx="4680000" cy="2632500"/>
+                    </a:xfrm>
+                    <a:prstGeom prst="rect"/>
+                  </pic:spPr>
+                </pic:pic>
+              </a:graphicData>
+            </a:graphic>
+          </wp:inline>
+        </w:drawing>
+      </w:r>
+    </w:p>
+    <w:p>
+      <w:r>
+        <w:rPr>
+          <w:i/>
+          <w:color w:val="404040"/>
+          <w:sz w:val="18"/>
+        </w:rPr>
+        <w:t>A session at work: the steps on the left, the plan on the right</w:t>
+      </w:r>
+    </w:p>
+    <w:p>
+      <w:r>
+        <w:br w:type="page"/>
       </w:r>
     </w:p>
     <w:p>
@@ -164,7 +546,7 @@
         <w:pStyle w:val="Heading1"/>
       </w:pPr>
       <w:r>
-        <w:t>2. Add tax indicators to the dashboard</w:t>
+        <w:t>Add tax indicators to the dashboard  (Claude Sonnet · Interactive)</w:t>
       </w:r>
     </w:p>
     <w:p>
@@ -172,10 +554,7 @@
         <w:rPr>
           <w:b/>
         </w:rPr>
-        <w:t xml:space="preserve">Model: </w:t>
-      </w:r>
-      <w:r>
-        <w:t>Claude Sonnet</w:t>
+        <w:t>Paste:</w:t>
       </w:r>
     </w:p>
     <w:p>
@@ -185,13 +564,16 @@
       <w:r>
         <w:rPr>
           <w:rFonts w:ascii="Consolas" w:hAnsi="Consolas"/>
-          <w:sz w:val="20"/>
+          <w:sz w:val="19"/>
         </w:rPr>
-        <w:t>Add VAT, personal income tax, corporate income tax and excises (% of GDP) to the dashboard, under Tax revenue, from the IMF WoRLD file already in raw_data. Follow TaxMacroFiscalDashboard/build/README.md. Then rebuild and show me Indonesia.</w:t>
+        <w:t>Add VAT, personal income tax, corporate income tax and excises (% of GDP) to the dashboard, under Tax revenue, from the IMF WoRLD file already in raw_data. Follow TaxMacroFiscalDashboard/build/README.md. Do not change anything else. Then rebuild and show me Indonesia.</w:t>
       </w:r>
     </w:p>
     <w:p>
       <w:r>
+        <w:rPr>
+          <w:b/>
+        </w:rPr>
         <w:t>Then:</w:t>
       </w:r>
     </w:p>
@@ -202,9 +584,9 @@
       <w:r>
         <w:rPr>
           <w:rFonts w:ascii="Consolas" w:hAnsi="Consolas"/>
-          <w:sz w:val="20"/>
+          <w:sz w:val="19"/>
         </w:rPr>
-        <w:t>Commit and push.</w:t>
+        <w:t>Commit and push with a clear message.</w:t>
       </w:r>
     </w:p>
     <w:p>
@@ -219,6 +601,92 @@
       </w:r>
     </w:p>
     <w:p>
+      <w:r>
+        <w:drawing>
+          <wp:inline xmlns:a="http://schemas.openxmlformats.org/drawingml/2006/main" xmlns:pic="http://schemas.openxmlformats.org/drawingml/2006/picture">
+            <wp:extent cx="4680000" cy="2632500"/>
+            <wp:docPr id="6" name="Picture 6"/>
+            <wp:cNvGraphicFramePr>
+              <a:graphicFrameLocks noChangeAspect="1"/>
+            </wp:cNvGraphicFramePr>
+            <a:graphic>
+              <a:graphicData uri="http://schemas.openxmlformats.org/drawingml/2006/picture">
+                <pic:pic>
+                  <pic:nvPicPr>
+                    <pic:cNvPr id="0" name="s_diff.png"/>
+                    <pic:cNvPicPr/>
+                  </pic:nvPicPr>
+                  <pic:blipFill>
+                    <a:blip r:embed="rId14"/>
+                    <a:stretch>
+                      <a:fillRect/>
+                    </a:stretch>
+                  </pic:blipFill>
+                  <pic:spPr>
+                    <a:xfrm>
+                      <a:off x="0" y="0"/>
+                      <a:ext cx="4680000" cy="2632500"/>
+                    </a:xfrm>
+                    <a:prstGeom prst="rect"/>
+                  </pic:spPr>
+                </pic:pic>
+              </a:graphicData>
+            </a:graphic>
+          </wp:inline>
+        </w:drawing>
+      </w:r>
+    </w:p>
+    <w:p>
+      <w:r>
+        <w:rPr>
+          <w:i/>
+          <w:color w:val="404040"/>
+          <w:sz w:val="18"/>
+        </w:rPr>
+        <w:t>The Changes view: every edit as a diff before you keep it</w:t>
+      </w:r>
+    </w:p>
+    <w:p>
+      <w:pPr>
+        <w:pStyle w:val="Heading1"/>
+      </w:pPr>
+      <w:r>
+        <w:t>Step 3. Save your work to GitHub</w:t>
+      </w:r>
+    </w:p>
+    <w:p>
+      <w:pPr>
+        <w:ind w:left="397" w:hanging="397"/>
+      </w:pPr>
+      <w:r>
+        <w:rPr>
+          <w:b/>
+        </w:rPr>
+        <w:t>1.</w:t>
+        <w:tab/>
+        <w:t xml:space="preserve">Ask Copilot. </w:t>
+      </w:r>
+      <w:r>
+        <w:t>Type: Commit and push with a clear message. Approve what it shows.</w:t>
+      </w:r>
+    </w:p>
+    <w:p>
+      <w:pPr>
+        <w:ind w:left="397" w:hanging="397"/>
+      </w:pPr>
+      <w:r>
+        <w:rPr>
+          <w:b/>
+        </w:rPr>
+        <w:t>2.</w:t>
+        <w:tab/>
+        <w:t xml:space="preserve">Or use the script. </w:t>
+      </w:r>
+      <w:r>
+        <w:t>Double-click SyncRepo.bat in the repo folder.</w:t>
+      </w:r>
+    </w:p>
+    <w:p>
       <w:pPr>
         <w:pStyle w:val="Heading1"/>
       </w:pPr>
@@ -228,7 +696,16 @@
     </w:p>
     <w:p>
       <w:r>
-        <w:t>With Claude instead: make a Claude Project, add excise_diagnostic_process.md to it, switch on Research, and paste the same prompts.</w:t>
+        <w:t>With Claude instead: on claude.ai make a Project, add excise_diagnostic_process.md, switch on Research, and paste the same prompts.</w:t>
+      </w:r>
+    </w:p>
+    <w:p>
+      <w:r>
+        <w:rPr>
+          <w:i/>
+          <w:sz w:val="17"/>
+        </w:rPr>
+        <w:t>Screenshots: GitHub, "GitHub Copilot app for Beginners" (github.com/github/copilot-app-for-beginners), MIT License, Copyright GitHub, Inc. The model names in them are examples; your screen will differ slightly.</w:t>
       </w:r>
     </w:p>
     <w:sectPr>
@@ -605,11 +1082,11 @@
     <w:qFormat/>
     <w:rsid w:val="00FC693F"/>
     <w:pPr>
-      <w:spacing w:after="100"/>
+      <w:spacing w:after="80"/>
     </w:pPr>
     <w:rPr>
       <w:rFonts w:ascii="Arial" w:hAnsi="Arial" w:eastAsia="Arial"/>
-      <w:sz w:val="22"/>
+      <w:sz w:val="21"/>
     </w:rPr>
   </w:style>
   <w:style w:type="paragraph" w:styleId="Header">

</xml_diff>